<commit_message>
Align Blackboard grading to 1,000 points with residency allocation
</commit_message>
<xml_diff>
--- a/Generative-AI/course-materials/blackboard/docx/Generative_AI_Week01_Module_Guide.docx
+++ b/Generative-AI/course-materials/blackboard/docx/Generative_AI_Week01_Module_Guide.docx
@@ -1795,7 +1795,7 @@
           <w:b w:val="0"/>
           <w:i w:val="0"/>
         </w:rPr>
-        <w:t>Type: Discussion Board. Points: 50. Submit one initial post and two peer responses in the Week 1 Discussion item. Use Blackboard’s displayed due dates.</w:t>
+        <w:t>Type: Discussion Board. Points: 10. Submit one initial post and two peer responses in the Week 1 Discussion item. Use Blackboard’s displayed due dates.</w:t>
       </w:r>
     </w:p>
     <w:p>
@@ -2110,7 +2110,7 @@
                 <w:b w:val="0"/>
                 <w:i w:val="0"/>
               </w:rPr>
-              <w:t>15</w:t>
+              <w:t>3</w:t>
             </w:r>
           </w:p>
         </w:tc>
@@ -2172,7 +2172,7 @@
                 <w:b w:val="0"/>
                 <w:i w:val="0"/>
               </w:rPr>
-              <w:t>15</w:t>
+              <w:t>3</w:t>
             </w:r>
           </w:p>
         </w:tc>
@@ -2234,7 +2234,7 @@
                 <w:b w:val="0"/>
                 <w:i w:val="0"/>
               </w:rPr>
-              <w:t>10</w:t>
+              <w:t>2</w:t>
             </w:r>
           </w:p>
         </w:tc>
@@ -2296,7 +2296,7 @@
                 <w:b w:val="0"/>
                 <w:i w:val="0"/>
               </w:rPr>
-              <w:t>10</w:t>
+              <w:t>2</w:t>
             </w:r>
           </w:p>
         </w:tc>
@@ -2351,7 +2351,7 @@
                 <w:b w:val="0"/>
                 <w:i w:val="0"/>
               </w:rPr>
-              <w:t>50</w:t>
+              <w:t>10</w:t>
             </w:r>
           </w:p>
         </w:tc>
@@ -2395,7 +2395,7 @@
           <w:b w:val="0"/>
           <w:i w:val="0"/>
         </w:rPr>
-        <w:t>Type: Applied analysis. Points: 75. Submit one PDF or DOCX to Week 1 Assignment 2. Aim for 600–800 words of analysis plus the requested matrix, diagram, prompts, or evidence appendix; these artifacts are not included in the word guide.</w:t>
+        <w:t>Type: Applied analysis. Points: 25. Submit one PDF or DOCX to Week 1 Assignment 2. Aim for 600–800 words of analysis plus the requested matrix, diagram, prompts, or evidence appendix; these artifacts are not included in the word guide.</w:t>
       </w:r>
     </w:p>
     <w:p>
@@ -2681,7 +2681,7 @@
                 <w:b w:val="0"/>
                 <w:i w:val="0"/>
               </w:rPr>
-              <w:t>15</w:t>
+              <w:t>5</w:t>
             </w:r>
           </w:p>
         </w:tc>
@@ -2743,7 +2743,7 @@
                 <w:b w:val="0"/>
                 <w:i w:val="0"/>
               </w:rPr>
-              <w:t>25</w:t>
+              <w:t>8</w:t>
             </w:r>
           </w:p>
         </w:tc>
@@ -2805,7 +2805,7 @@
                 <w:b w:val="0"/>
                 <w:i w:val="0"/>
               </w:rPr>
-              <w:t>15</w:t>
+              <w:t>5</w:t>
             </w:r>
           </w:p>
         </w:tc>
@@ -2867,7 +2867,7 @@
                 <w:b w:val="0"/>
                 <w:i w:val="0"/>
               </w:rPr>
-              <w:t>15</w:t>
+              <w:t>5</w:t>
             </w:r>
           </w:p>
         </w:tc>
@@ -2929,7 +2929,7 @@
                 <w:b w:val="0"/>
                 <w:i w:val="0"/>
               </w:rPr>
-              <w:t>5</w:t>
+              <w:t>2</w:t>
             </w:r>
           </w:p>
         </w:tc>
@@ -2984,7 +2984,7 @@
                 <w:b w:val="0"/>
                 <w:i w:val="0"/>
               </w:rPr>
-              <w:t>75</w:t>
+              <w:t>25</w:t>
             </w:r>
           </w:p>
         </w:tc>
@@ -3018,7 +3018,7 @@
           <w:b w:val="0"/>
           <w:i w:val="0"/>
         </w:rPr>
-        <w:t>Type: Project portfolio milestone. Points: 50. Submit a PDF or DOCX to Week 1 Project Milestone. Preserve the author’s required elements below and retain an editable copy for Week 16.</w:t>
+        <w:t>Type: Project portfolio milestone. Points: 15. Submit a PDF or DOCX to Week 1 Project Milestone. Preserve the author’s required elements below and retain an editable copy for Week 16.</w:t>
       </w:r>
     </w:p>
     <w:p>
@@ -3366,7 +3366,7 @@
                 <w:b w:val="0"/>
                 <w:i w:val="0"/>
               </w:rPr>
-              <w:t>15</w:t>
+              <w:t>4</w:t>
             </w:r>
           </w:p>
         </w:tc>
@@ -3428,7 +3428,7 @@
                 <w:b w:val="0"/>
                 <w:i w:val="0"/>
               </w:rPr>
-              <w:t>10</w:t>
+              <w:t>3</w:t>
             </w:r>
           </w:p>
         </w:tc>
@@ -3490,7 +3490,7 @@
                 <w:b w:val="0"/>
                 <w:i w:val="0"/>
               </w:rPr>
-              <w:t>15</w:t>
+              <w:t>5</w:t>
             </w:r>
           </w:p>
         </w:tc>
@@ -3552,7 +3552,7 @@
                 <w:b w:val="0"/>
                 <w:i w:val="0"/>
               </w:rPr>
-              <w:t>10</w:t>
+              <w:t>3</w:t>
             </w:r>
           </w:p>
         </w:tc>
@@ -3607,7 +3607,7 @@
                 <w:b w:val="0"/>
                 <w:i w:val="0"/>
               </w:rPr>
-              <w:t>50</w:t>
+              <w:t>15</w:t>
             </w:r>
           </w:p>
         </w:tc>
@@ -3819,7 +3819,7 @@
                 <w:b w:val="0"/>
                 <w:i w:val="0"/>
               </w:rPr>
-              <w:t>50</w:t>
+              <w:t>10</w:t>
             </w:r>
           </w:p>
         </w:tc>
@@ -3900,7 +3900,7 @@
                 <w:b w:val="0"/>
                 <w:i w:val="0"/>
               </w:rPr>
-              <w:t>75</w:t>
+              <w:t>25</w:t>
             </w:r>
           </w:p>
         </w:tc>
@@ -3981,7 +3981,7 @@
                 <w:b w:val="0"/>
                 <w:i w:val="0"/>
               </w:rPr>
-              <w:t>50</w:t>
+              <w:t>15</w:t>
             </w:r>
           </w:p>
         </w:tc>
@@ -4048,7 +4048,7 @@
                 <w:b w:val="0"/>
                 <w:i w:val="0"/>
               </w:rPr>
-              <w:t>175</w:t>
+              <w:t>50</w:t>
             </w:r>
           </w:p>
         </w:tc>

</xml_diff>